<commit_message>
Updating the Formater ipynb
</commit_message>
<xml_diff>
--- a/suggested attributes for the dataset.docx
+++ b/suggested attributes for the dataset.docx
@@ -438,6 +438,15 @@
       <w:pPr>
         <w:rPr>
           <w:rFonts w:ascii="Bahnschrift" w:hAnsi="Bahnschrift"/>
+          <w:sz w:val="28"/>
+          <w:szCs w:val="28"/>
+        </w:rPr>
+      </w:pPr>
+    </w:p>
+    <w:p>
+      <w:pPr>
+        <w:rPr>
+          <w:rFonts w:ascii="Bahnschrift" w:hAnsi="Bahnschrift"/>
           <w:b/>
           <w:bCs/>
           <w:sz w:val="28"/>
@@ -452,7 +461,6 @@
           <w:sz w:val="28"/>
           <w:szCs w:val="28"/>
         </w:rPr>
-        <w:lastRenderedPageBreak/>
         <w:t>physical</w:t>
       </w:r>
     </w:p>

</xml_diff>